<commit_message>
Revamp of proposal generator. - Changed page layout to multi-part process - Updated language of templates. - Allowed word export with direct formatting. - Allowed direct entering of costs, retainers, and charge types.
</commit_message>
<xml_diff>
--- a/sites/document/public/templates/project-proposal.docx
+++ b/sites/document/public/templates/project-proposal.docx
@@ -218,7 +218,7 @@
                 <w:b/>
                 <w:bCs/>
               </w:rPr>
-              <w:t>{clientAddressLine1}</w:t>
+              <w:t>{clientAddress}</w:t>
             </w:r>
           </w:p>
         </w:tc>
@@ -510,7 +510,7 @@
           <w:sz w:val="32"/>
           <w:szCs w:val="32"/>
         </w:rPr>
-        <w:t>: $</w:t>
+        <w:t xml:space="preserve">: </w:t>
       </w:r>
       <w:r>
         <w:rPr>
@@ -540,16 +540,6 @@
           <w:szCs w:val="28"/>
         </w:rPr>
         <w:t xml:space="preserve">Retainer to be paid before the project can start: </w:t>
-      </w:r>
-      <w:r>
-        <w:rPr>
-          <w:b/>
-          <w:bCs/>
-          <w:color w:val="676767"/>
-          <w:sz w:val="28"/>
-          <w:szCs w:val="28"/>
-        </w:rPr>
-        <w:t>$</w:t>
       </w:r>
       <w:r>
         <w:rPr>
@@ -1084,7 +1074,25 @@
     </w:p>
     <w:p>
       <w:r>
+        <w:t>{#services}</w:t>
+      </w:r>
+    </w:p>
+    <w:p>
+      <w:pPr>
+        <w:pStyle w:val="Heading3"/>
+      </w:pPr>
+      <w:r>
+        <w:t>PHASE {index}: {serviceName}</w:t>
+      </w:r>
+    </w:p>
+    <w:p>
+      <w:r>
         <w:t>{scopeOfWork}</w:t>
+      </w:r>
+    </w:p>
+    <w:p>
+      <w:r>
+        <w:t>{/services}</w:t>
       </w:r>
     </w:p>
     <w:p>
@@ -1110,11 +1118,11 @@
         <w:tblLook w:val="04E0" w:firstRow="1" w:lastRow="1" w:firstColumn="1" w:lastColumn="0" w:noHBand="0" w:noVBand="1"/>
       </w:tblPr>
       <w:tblGrid>
-        <w:gridCol w:w="802"/>
-        <w:gridCol w:w="3351"/>
-        <w:gridCol w:w="2152"/>
-        <w:gridCol w:w="2152"/>
-        <w:gridCol w:w="893"/>
+        <w:gridCol w:w="1736"/>
+        <w:gridCol w:w="2318"/>
+        <w:gridCol w:w="1752"/>
+        <w:gridCol w:w="1944"/>
+        <w:gridCol w:w="1600"/>
       </w:tblGrid>
       <w:tr>
         <w:tc>
@@ -1258,7 +1266,7 @@
               <w:jc w:val="center"/>
             </w:pPr>
             <w:r>
-              <w:t>01</w:t>
+              <w:t>{#services}{index}</w:t>
             </w:r>
           </w:p>
         </w:tc>
@@ -1274,7 +1282,7 @@
               <w:spacing w:before="60" w:after="60"/>
             </w:pPr>
             <w:r>
-              <w:t>Survey Description</w:t>
+              <w:t>{serviceName}</w:t>
             </w:r>
           </w:p>
         </w:tc>
@@ -1292,10 +1300,13 @@
               <w:jc w:val="center"/>
             </w:pPr>
             <w:r>
-              <w:t>$</w:t>
+              <w:t>{</w:t>
             </w:r>
             <w:r>
-              <w:t>4,500.00</w:t>
+              <w:t>serviceCost</w:t>
+            </w:r>
+            <w:r>
+              <w:t>}</w:t>
             </w:r>
           </w:p>
         </w:tc>
@@ -1313,7 +1324,13 @@
               <w:jc w:val="center"/>
             </w:pPr>
             <w:r>
-              <w:t>$2,000.00</w:t>
+              <w:t>{</w:t>
+            </w:r>
+            <w:r>
+              <w:t>service</w:t>
+            </w:r>
+            <w:r>
+              <w:t>Retainer}</w:t>
             </w:r>
           </w:p>
         </w:tc>
@@ -1331,67 +1348,8 @@
               <w:jc w:val="center"/>
             </w:pPr>
             <w:r>
-              <w:t>FF</w:t>
+              <w:t>{type}{/services}</w:t>
             </w:r>
-          </w:p>
-        </w:tc>
-      </w:tr>
-      <w:tr>
-        <w:tc>
-          <w:tcPr>
-            <w:tcW w:w="802" w:type="dxa"/>
-          </w:tcPr>
-          <w:p>
-            <w:pPr>
-              <w:spacing w:before="60" w:after="60"/>
-              <w:jc w:val="center"/>
-            </w:pPr>
-          </w:p>
-        </w:tc>
-        <w:tc>
-          <w:tcPr>
-            <w:tcW w:w="3351" w:type="dxa"/>
-          </w:tcPr>
-          <w:p>
-            <w:pPr>
-              <w:spacing w:before="60" w:after="60"/>
-            </w:pPr>
-          </w:p>
-        </w:tc>
-        <w:tc>
-          <w:tcPr>
-            <w:tcW w:w="2152" w:type="dxa"/>
-            <w:vAlign w:val="center"/>
-          </w:tcPr>
-          <w:p>
-            <w:pPr>
-              <w:spacing w:before="60" w:after="60"/>
-              <w:jc w:val="center"/>
-            </w:pPr>
-          </w:p>
-        </w:tc>
-        <w:tc>
-          <w:tcPr>
-            <w:tcW w:w="2152" w:type="dxa"/>
-            <w:vAlign w:val="center"/>
-          </w:tcPr>
-          <w:p>
-            <w:pPr>
-              <w:spacing w:before="60" w:after="60"/>
-              <w:jc w:val="center"/>
-            </w:pPr>
-          </w:p>
-        </w:tc>
-        <w:tc>
-          <w:tcPr>
-            <w:tcW w:w="893" w:type="dxa"/>
-            <w:vAlign w:val="center"/>
-          </w:tcPr>
-          <w:p>
-            <w:pPr>
-              <w:spacing w:before="60" w:after="60"/>
-              <w:jc w:val="center"/>
-            </w:pPr>
           </w:p>
         </w:tc>
       </w:tr>
@@ -1447,44 +1405,7 @@
                 <w:b/>
                 <w:bCs/>
               </w:rPr>
-              <w:fldChar w:fldCharType="begin"/>
-            </w:r>
-            <w:r>
-              <w:rPr>
-                <w:b/>
-                <w:bCs/>
-              </w:rPr>
-              <w:instrText xml:space="preserve"> =SUM(ABOVE) \# "$#,##0.00;($#,##0.00)" </w:instrText>
-            </w:r>
-            <w:r>
-              <w:rPr>
-                <w:b/>
-                <w:bCs/>
-              </w:rPr>
-              <w:fldChar w:fldCharType="separate"/>
-            </w:r>
-            <w:r>
-              <w:rPr>
-                <w:b/>
-                <w:bCs/>
-                <w:noProof/>
-              </w:rPr>
-              <w:t>$</w:t>
-            </w:r>
-            <w:r>
-              <w:rPr>
-                <w:b/>
-                <w:bCs/>
-                <w:noProof/>
-              </w:rPr>
-              <w:t>4,600.00</w:t>
-            </w:r>
-            <w:r>
-              <w:rPr>
-                <w:b/>
-                <w:bCs/>
-              </w:rPr>
-              <w:fldChar w:fldCharType="end"/>
+              <w:t>{projectCost}</w:t>
             </w:r>
           </w:p>
         </w:tc>
@@ -1507,44 +1428,7 @@
                 <w:b/>
                 <w:bCs/>
               </w:rPr>
-              <w:fldChar w:fldCharType="begin"/>
-            </w:r>
-            <w:r>
-              <w:rPr>
-                <w:b/>
-                <w:bCs/>
-              </w:rPr>
-              <w:instrText xml:space="preserve"> =SUM(ABOVE) \# "$#,##0.00;($#,##0.00)" </w:instrText>
-            </w:r>
-            <w:r>
-              <w:rPr>
-                <w:b/>
-                <w:bCs/>
-              </w:rPr>
-              <w:fldChar w:fldCharType="separate"/>
-            </w:r>
-            <w:r>
-              <w:rPr>
-                <w:b/>
-                <w:bCs/>
-                <w:noProof/>
-              </w:rPr>
-              <w:t>$</w:t>
-            </w:r>
-            <w:r>
-              <w:rPr>
-                <w:b/>
-                <w:bCs/>
-                <w:noProof/>
-              </w:rPr>
-              <w:t>2,000.00</w:t>
-            </w:r>
-            <w:r>
-              <w:rPr>
-                <w:b/>
-                <w:bCs/>
-              </w:rPr>
-              <w:fldChar w:fldCharType="end"/>
+              <w:t>{projectRetainer}</w:t>
             </w:r>
           </w:p>
         </w:tc>

</xml_diff>

<commit_message>
feat(commentsManager): add comments and review package management components
- Implemented CommentEditor for editing comments with status management.
- Created NewPackage component for adding new review packages.
- Developed PackageSelection for selecting and managing review packages.
- Added createPDF functionality to generate PDF reports for comments.
- Introduced api.ts for centralized comment API exports.
- Updated index.ts to export new components for comments management.
</commit_message>
<xml_diff>
--- a/sites/document/public/templates/project-proposal.docx
+++ b/sites/document/public/templates/project-proposal.docx
@@ -1087,7 +1087,7 @@
     </w:p>
     <w:p>
       <w:r>
-        <w:t>{scopeOfWork}</w:t>
+        <w:t>{scopeOfWorkRichXml}</w:t>
       </w:r>
     </w:p>
     <w:p>
@@ -1115,19 +1115,20 @@
       <w:tblPr>
         <w:tblStyle w:val="TableGridLight"/>
         <w:tblW w:w="0" w:type="auto"/>
+        <w:tblLayout w:type="fixed"/>
         <w:tblLook w:val="04E0" w:firstRow="1" w:lastRow="1" w:firstColumn="1" w:lastColumn="0" w:noHBand="0" w:noVBand="1"/>
       </w:tblPr>
       <w:tblGrid>
-        <w:gridCol w:w="1736"/>
-        <w:gridCol w:w="2318"/>
-        <w:gridCol w:w="1752"/>
-        <w:gridCol w:w="1944"/>
-        <w:gridCol w:w="1600"/>
+        <w:gridCol w:w="805"/>
+        <w:gridCol w:w="4500"/>
+        <w:gridCol w:w="1620"/>
+        <w:gridCol w:w="1620"/>
+        <w:gridCol w:w="805"/>
       </w:tblGrid>
       <w:tr>
         <w:tc>
           <w:tcPr>
-            <w:tcW w:w="802" w:type="dxa"/>
+            <w:tcW w:w="805" w:type="dxa"/>
             <w:tcBorders>
               <w:bottom w:val="single" w:sz="4" w:space="0" w:color="auto"/>
             </w:tcBorders>
@@ -1151,7 +1152,7 @@
         </w:tc>
         <w:tc>
           <w:tcPr>
-            <w:tcW w:w="3351" w:type="dxa"/>
+            <w:tcW w:w="4500" w:type="dxa"/>
             <w:tcBorders>
               <w:bottom w:val="single" w:sz="4" w:space="0" w:color="auto"/>
             </w:tcBorders>
@@ -1175,7 +1176,7 @@
         </w:tc>
         <w:tc>
           <w:tcPr>
-            <w:tcW w:w="2152" w:type="dxa"/>
+            <w:tcW w:w="1620" w:type="dxa"/>
             <w:tcBorders>
               <w:bottom w:val="single" w:sz="4" w:space="0" w:color="auto"/>
             </w:tcBorders>
@@ -1201,7 +1202,7 @@
         </w:tc>
         <w:tc>
           <w:tcPr>
-            <w:tcW w:w="2152" w:type="dxa"/>
+            <w:tcW w:w="1620" w:type="dxa"/>
             <w:tcBorders>
               <w:bottom w:val="single" w:sz="4" w:space="0" w:color="auto"/>
             </w:tcBorders>
@@ -1227,7 +1228,7 @@
         </w:tc>
         <w:tc>
           <w:tcPr>
-            <w:tcW w:w="893" w:type="dxa"/>
+            <w:tcW w:w="805" w:type="dxa"/>
             <w:tcBorders>
               <w:bottom w:val="single" w:sz="4" w:space="0" w:color="auto"/>
             </w:tcBorders>
@@ -1255,27 +1256,27 @@
       <w:tr>
         <w:tc>
           <w:tcPr>
-            <w:tcW w:w="802" w:type="dxa"/>
-            <w:tcBorders>
-              <w:top w:val="single" w:sz="4" w:space="0" w:color="auto"/>
-            </w:tcBorders>
+            <w:tcW w:w="805" w:type="dxa"/>
           </w:tcPr>
           <w:p>
             <w:pPr>
               <w:spacing w:before="60" w:after="60"/>
-              <w:jc w:val="center"/>
+              <w:jc w:val="left"/>
             </w:pPr>
             <w:r>
-              <w:t>{#services}{index}</w:t>
+              <w:t>{#</w:t>
+            </w:r>
+            <w:r>
+              <w:t>services</w:t>
+            </w:r>
+            <w:r>
+              <w:t>}{index}</w:t>
             </w:r>
           </w:p>
         </w:tc>
         <w:tc>
           <w:tcPr>
-            <w:tcW w:w="3351" w:type="dxa"/>
-            <w:tcBorders>
-              <w:top w:val="single" w:sz="4" w:space="0" w:color="auto"/>
-            </w:tcBorders>
+            <w:tcW w:w="4500" w:type="dxa"/>
           </w:tcPr>
           <w:p>
             <w:pPr>
@@ -1288,10 +1289,7 @@
         </w:tc>
         <w:tc>
           <w:tcPr>
-            <w:tcW w:w="2152" w:type="dxa"/>
-            <w:tcBorders>
-              <w:top w:val="single" w:sz="4" w:space="0" w:color="auto"/>
-            </w:tcBorders>
+            <w:tcW w:w="1620" w:type="dxa"/>
             <w:vAlign w:val="center"/>
           </w:tcPr>
           <w:p>
@@ -1300,22 +1298,13 @@
               <w:jc w:val="center"/>
             </w:pPr>
             <w:r>
-              <w:t>{</w:t>
-            </w:r>
-            <w:r>
-              <w:t>serviceCost</w:t>
-            </w:r>
-            <w:r>
-              <w:t>}</w:t>
+              <w:t>{serviceCost}</w:t>
             </w:r>
           </w:p>
         </w:tc>
         <w:tc>
           <w:tcPr>
-            <w:tcW w:w="2152" w:type="dxa"/>
-            <w:tcBorders>
-              <w:top w:val="single" w:sz="4" w:space="0" w:color="auto"/>
-            </w:tcBorders>
+            <w:tcW w:w="1620" w:type="dxa"/>
             <w:vAlign w:val="center"/>
           </w:tcPr>
           <w:p>
@@ -1324,22 +1313,13 @@
               <w:jc w:val="center"/>
             </w:pPr>
             <w:r>
-              <w:t>{</w:t>
-            </w:r>
-            <w:r>
-              <w:t>service</w:t>
-            </w:r>
-            <w:r>
-              <w:t>Retainer}</w:t>
+              <w:t>{serviceRetainer}</w:t>
             </w:r>
           </w:p>
         </w:tc>
         <w:tc>
           <w:tcPr>
-            <w:tcW w:w="893" w:type="dxa"/>
-            <w:tcBorders>
-              <w:top w:val="single" w:sz="4" w:space="0" w:color="auto"/>
-            </w:tcBorders>
+            <w:tcW w:w="805" w:type="dxa"/>
             <w:vAlign w:val="center"/>
           </w:tcPr>
           <w:p>
@@ -1348,7 +1328,13 @@
               <w:jc w:val="center"/>
             </w:pPr>
             <w:r>
-              <w:t>{type}{/services}</w:t>
+              <w:t>{type}{/</w:t>
+            </w:r>
+            <w:r>
+              <w:t>services</w:t>
+            </w:r>
+            <w:r>
+              <w:t>}</w:t>
             </w:r>
           </w:p>
         </w:tc>
@@ -1356,7 +1342,7 @@
       <w:tr>
         <w:tc>
           <w:tcPr>
-            <w:tcW w:w="802" w:type="dxa"/>
+            <w:tcW w:w="805" w:type="dxa"/>
           </w:tcPr>
           <w:p>
             <w:pPr>
@@ -1367,7 +1353,7 @@
         </w:tc>
         <w:tc>
           <w:tcPr>
-            <w:tcW w:w="3351" w:type="dxa"/>
+            <w:tcW w:w="4500" w:type="dxa"/>
           </w:tcPr>
           <w:p>
             <w:pPr>
@@ -1388,7 +1374,7 @@
         </w:tc>
         <w:tc>
           <w:tcPr>
-            <w:tcW w:w="2152" w:type="dxa"/>
+            <w:tcW w:w="1620" w:type="dxa"/>
             <w:vAlign w:val="center"/>
           </w:tcPr>
           <w:p>
@@ -1411,7 +1397,7 @@
         </w:tc>
         <w:tc>
           <w:tcPr>
-            <w:tcW w:w="2152" w:type="dxa"/>
+            <w:tcW w:w="1620" w:type="dxa"/>
             <w:vAlign w:val="center"/>
           </w:tcPr>
           <w:p>
@@ -1434,7 +1420,7 @@
         </w:tc>
         <w:tc>
           <w:tcPr>
-            <w:tcW w:w="893" w:type="dxa"/>
+            <w:tcW w:w="805" w:type="dxa"/>
             <w:vAlign w:val="center"/>
           </w:tcPr>
           <w:p>

</xml_diff>